<commit_message>
Update Class 10 slides (n = 847, not 846)
</commit_message>
<xml_diff>
--- a/class10w.docx
+++ b/class10w.docx
@@ -1086,13 +1086,13 @@
       </w:r>
     </w:p>
     <w:bookmarkEnd w:id="26"/>
-    <w:bookmarkStart w:id="27" w:name="filter-to-846-complete-cases"/>
+    <w:bookmarkStart w:id="27" w:name="filter-to-847-complete-cases"/>
     <w:p>
       <w:pPr>
         <w:pStyle w:val="Heading2"/>
       </w:pPr>
       <w:r>
-        <w:t xml:space="preserve">Filter to 846 complete cases</w:t>
+        <w:t xml:space="preserve">Filter to 847 complete cases</w:t>
       </w:r>
     </w:p>
     <w:p>
@@ -2225,13 +2225,13 @@
       </w:r>
     </w:p>
     <w:bookmarkEnd w:id="33"/>
-    <w:bookmarkStart w:id="37" w:name="scatterplot-of-846-elders"/>
+    <w:bookmarkStart w:id="37" w:name="scatterplot-of-847-elders"/>
     <w:p>
       <w:pPr>
         <w:pStyle w:val="Heading2"/>
       </w:pPr>
       <w:r>
-        <w:t xml:space="preserve">Scatterplot of 846 elders</w:t>
+        <w:t xml:space="preserve">Scatterplot of 847 elders</w:t>
       </w:r>
     </w:p>
     <w:p>
@@ -2694,7 +2694,7 @@
         <w:rPr>
           <w:rStyle w:val="StringTok"/>
         </w:rPr>
-        <w:t xml:space="preserve">"EUROFAMCARE data for 846 subjects"</w:t>
+        <w:t xml:space="preserve">"EUROFAMCARE data for 847 subjects"</w:t>
       </w:r>
       <w:r>
         <w:rPr>
@@ -3271,7 +3271,7 @@
         <w:rPr>
           <w:rStyle w:val="StringTok"/>
         </w:rPr>
-        <w:t xml:space="preserve">"Jittered EUROFAMCARE data for 846 subjects"</w:t>
+        <w:t xml:space="preserve">"Jittered EUROFAMCARE data for 847 subjects"</w:t>
       </w:r>
       <w:r>
         <w:rPr>
@@ -7767,7 +7767,7 @@
         <w:rPr>
           <w:rStyle w:val="StringTok"/>
         </w:rPr>
-        <w:t xml:space="preserve">"EUROFAMCARE data for 846 subjects"</w:t>
+        <w:t xml:space="preserve">"EUROFAMCARE data for 847 subjects"</w:t>
       </w:r>
       <w:r>
         <w:rPr>

</xml_diff>